<commit_message>
change request id to application id input by transport dispatcher
</commit_message>
<xml_diff>
--- a/generated_docx/flight_1_2026-12-12.docx
+++ b/generated_docx/flight_1_2026-12-12.docx
@@ -13,13 +13,13 @@
     <w:p/>
     <w:p>
       <w:r>
-        <w:t>на «12» декабря 2026г суббота</w:t>
+        <w:t>12.12.2026 суббота</w:t>
       </w:r>
     </w:p>
     <w:p/>
     <w:p>
       <w:r>
-        <w:t>1. Ми-8Т 12122 ГЗП 1212 время вылета 12:12 кол-во кресел 22</w:t>
+        <w:t>1. Ми-8Т 12123 ГЗП 1212 время вылета 12:12 кол-во кресел 22</w:t>
       </w:r>
     </w:p>
     <w:p>

</xml_diff>